<commit_message>
docs: attach GitHub Pages deployment and live working app screenshots to Word and PDF dossiers
</commit_message>
<xml_diff>
--- a/docs/Exam_Submission_Dossier_MAI412_2.docx
+++ b/docs/Exam_Submission_Dossier_MAI412_2.docx
@@ -1020,13 +1020,134 @@
         <w:t>Branch: main (Clean, up-to-date, tracking origin/main)</w:t>
         <w:br/>
         <w:br/>
-        <w:t>2. Deployed Application URL:</w:t>
+        <w:t>2. Deployed Application URL &amp; Deployment Verification:</w:t>
         <w:br/>
         <w:t>GitHub Pages Deployment: https://anushyaaaa.github.io/fds-mid/</w:t>
         <w:br/>
         <w:t>Local Run Command: python -m http.server 8000 (accessible at http://localhost:8000)</w:t>
         <w:br/>
         <w:br/>
+        <w:t>Deployment Evidence &amp; Working Feature Screenshots:</w:t>
+      </w:r>
+    </w:p>
+    <w:p>
+      <w:pPr>
+        <w:spacing w:before="120"/>
+      </w:pPr>
+    </w:p>
+    <w:p>
+      <w:r>
+        <w:drawing>
+          <wp:inline xmlns:a="http://schemas.openxmlformats.org/drawingml/2006/main" xmlns:pic="http://schemas.openxmlformats.org/drawingml/2006/picture">
+            <wp:extent cx="5669280" cy="3164249"/>
+            <wp:docPr id="3" name="Picture 3"/>
+            <wp:cNvGraphicFramePr>
+              <a:graphicFrameLocks noChangeAspect="1"/>
+            </wp:cNvGraphicFramePr>
+            <a:graphic>
+              <a:graphicData uri="http://schemas.openxmlformats.org/drawingml/2006/picture">
+                <pic:pic>
+                  <pic:nvPicPr>
+                    <pic:cNvPr id="0" name="github_pages_deployment.jpg"/>
+                    <pic:cNvPicPr/>
+                  </pic:nvPicPr>
+                  <pic:blipFill>
+                    <a:blip r:embed="rId11"/>
+                    <a:stretch>
+                      <a:fillRect/>
+                    </a:stretch>
+                  </pic:blipFill>
+                  <pic:spPr>
+                    <a:xfrm>
+                      <a:off x="0" y="0"/>
+                      <a:ext cx="5669280" cy="3164249"/>
+                    </a:xfrm>
+                    <a:prstGeom prst="rect"/>
+                  </pic:spPr>
+                </pic:pic>
+              </a:graphicData>
+            </a:graphic>
+          </wp:inline>
+        </w:drawing>
+      </w:r>
+    </w:p>
+    <w:p>
+      <w:pPr>
+        <w:jc w:val="center"/>
+      </w:pPr>
+      <w:r>
+        <w:rPr>
+          <w:i/>
+          <w:sz w:val="19"/>
+        </w:rPr>
+        <w:t>Figure 3: GitHub Pages Deployment Verification – Active deployment settings at https://github.com/Anushyaaaa/fds-mid/settings/pages showing live site.</w:t>
+      </w:r>
+    </w:p>
+    <w:p>
+      <w:pPr>
+        <w:spacing w:after="120"/>
+      </w:pPr>
+    </w:p>
+    <w:p>
+      <w:pPr>
+        <w:spacing w:before="120"/>
+      </w:pPr>
+    </w:p>
+    <w:p>
+      <w:r>
+        <w:drawing>
+          <wp:inline xmlns:a="http://schemas.openxmlformats.org/drawingml/2006/main" xmlns:pic="http://schemas.openxmlformats.org/drawingml/2006/picture">
+            <wp:extent cx="5669280" cy="3164249"/>
+            <wp:docPr id="4" name="Picture 4"/>
+            <wp:cNvGraphicFramePr>
+              <a:graphicFrameLocks noChangeAspect="1"/>
+            </wp:cNvGraphicFramePr>
+            <a:graphic>
+              <a:graphicData uri="http://schemas.openxmlformats.org/drawingml/2006/picture">
+                <pic:pic>
+                  <pic:nvPicPr>
+                    <pic:cNvPr id="0" name="live_deployed_application.jpg"/>
+                    <pic:cNvPicPr/>
+                  </pic:nvPicPr>
+                  <pic:blipFill>
+                    <a:blip r:embed="rId12"/>
+                    <a:stretch>
+                      <a:fillRect/>
+                    </a:stretch>
+                  </pic:blipFill>
+                  <pic:spPr>
+                    <a:xfrm>
+                      <a:off x="0" y="0"/>
+                      <a:ext cx="5669280" cy="3164249"/>
+                    </a:xfrm>
+                    <a:prstGeom prst="rect"/>
+                  </pic:spPr>
+                </pic:pic>
+              </a:graphicData>
+            </a:graphic>
+          </wp:inline>
+        </w:drawing>
+      </w:r>
+    </w:p>
+    <w:p>
+      <w:pPr>
+        <w:jc w:val="center"/>
+      </w:pPr>
+      <w:r>
+        <w:rPr>
+          <w:i/>
+          <w:sz w:val="19"/>
+        </w:rPr>
+        <w:t>Figure 4: Working Live Application Interface – Browser execution at https://anushyaaaa.github.io/fds-mid/ displaying active campus navigation.</w:t>
+      </w:r>
+    </w:p>
+    <w:p>
+      <w:pPr>
+        <w:spacing w:after="120"/>
+      </w:pPr>
+    </w:p>
+    <w:p>
+      <w:r>
         <w:t>3. Meaningful Git Commit History:</w:t>
       </w:r>
     </w:p>
@@ -1106,6 +1227,134 @@
                 <w:sz w:val="18"/>
               </w:rPr>
               <w:t>Message &amp; Implementation Description</w:t>
+            </w:r>
+          </w:p>
+        </w:tc>
+      </w:tr>
+      <w:tr>
+        <w:tc>
+          <w:tcPr>
+            <w:tcW w:type="dxa" w:w="1728"/>
+            <w:shd w:fill="F8FAFC"/>
+            <w:tcMar>
+              <w:top w:w="60" w:type="dxa"/>
+              <w:bottom w:w="60" w:type="dxa"/>
+              <w:left w:w="80" w:type="dxa"/>
+              <w:right w:w="80" w:type="dxa"/>
+            </w:tcMar>
+          </w:tcPr>
+          <w:p>
+            <w:r>
+              <w:rPr>
+                <w:rFonts w:ascii="Consolas" w:hAnsi="Consolas"/>
+                <w:b/>
+                <w:sz w:val="17"/>
+              </w:rPr>
+              <w:t>9611a73</w:t>
+            </w:r>
+          </w:p>
+        </w:tc>
+        <w:tc>
+          <w:tcPr>
+            <w:tcW w:type="dxa" w:w="1728"/>
+            <w:shd w:fill="F8FAFC"/>
+            <w:tcMar>
+              <w:top w:w="60" w:type="dxa"/>
+              <w:bottom w:w="60" w:type="dxa"/>
+              <w:left w:w="80" w:type="dxa"/>
+              <w:right w:w="80" w:type="dxa"/>
+            </w:tcMar>
+          </w:tcPr>
+          <w:p>
+            <w:r>
+              <w:rPr>
+                <w:sz w:val="17"/>
+              </w:rPr>
+              <w:t>docs</w:t>
+            </w:r>
+          </w:p>
+        </w:tc>
+        <w:tc>
+          <w:tcPr>
+            <w:tcW w:type="dxa" w:w="5904"/>
+            <w:shd w:fill="F8FAFC"/>
+            <w:tcMar>
+              <w:top w:w="60" w:type="dxa"/>
+              <w:bottom w:w="60" w:type="dxa"/>
+              <w:left w:w="80" w:type="dxa"/>
+              <w:right w:w="80" w:type="dxa"/>
+            </w:tcMar>
+          </w:tcPr>
+          <w:p>
+            <w:r>
+              <w:rPr>
+                <w:sz w:val="17"/>
+              </w:rPr>
+              <w:t>add official PDF version of exam submission dossier</w:t>
+            </w:r>
+          </w:p>
+        </w:tc>
+      </w:tr>
+      <w:tr>
+        <w:tc>
+          <w:tcPr>
+            <w:tcW w:type="dxa" w:w="1728"/>
+            <w:shd w:fill="FFFFFF"/>
+            <w:tcMar>
+              <w:top w:w="60" w:type="dxa"/>
+              <w:bottom w:w="60" w:type="dxa"/>
+              <w:left w:w="80" w:type="dxa"/>
+              <w:right w:w="80" w:type="dxa"/>
+            </w:tcMar>
+          </w:tcPr>
+          <w:p>
+            <w:r>
+              <w:rPr>
+                <w:rFonts w:ascii="Consolas" w:hAnsi="Consolas"/>
+                <w:b/>
+                <w:sz w:val="17"/>
+              </w:rPr>
+              <w:t>9522f0c</w:t>
+            </w:r>
+          </w:p>
+        </w:tc>
+        <w:tc>
+          <w:tcPr>
+            <w:tcW w:type="dxa" w:w="1728"/>
+            <w:shd w:fill="FFFFFF"/>
+            <w:tcMar>
+              <w:top w:w="60" w:type="dxa"/>
+              <w:bottom w:w="60" w:type="dxa"/>
+              <w:left w:w="80" w:type="dxa"/>
+              <w:right w:w="80" w:type="dxa"/>
+            </w:tcMar>
+          </w:tcPr>
+          <w:p>
+            <w:r>
+              <w:rPr>
+                <w:sz w:val="17"/>
+              </w:rPr>
+              <w:t>docs</w:t>
+            </w:r>
+          </w:p>
+        </w:tc>
+        <w:tc>
+          <w:tcPr>
+            <w:tcW w:type="dxa" w:w="5904"/>
+            <w:shd w:fill="FFFFFF"/>
+            <w:tcMar>
+              <w:top w:w="60" w:type="dxa"/>
+              <w:bottom w:w="60" w:type="dxa"/>
+              <w:left w:w="80" w:type="dxa"/>
+              <w:right w:w="80" w:type="dxa"/>
+            </w:tcMar>
+          </w:tcPr>
+          <w:p>
+            <w:r>
+              <w:rPr>
+                <w:sz w:val="17"/>
+              </w:rPr>
+              <w:t>add official Microsoft Word (.docx) exam submission dossier and generator script</w:t>
             </w:r>
           </w:p>
         </w:tc>

</xml_diff>